<commit_message>
docs: verify downloadable reports and improve reviewer evidence readability
</commit_message>
<xml_diff>
--- a/docs/research/reviewer-followup-v2/final-research-update.docx
+++ b/docs/research/reviewer-followup-v2/final-research-update.docx
@@ -16,7 +16,7 @@
         <w:pStyle w:val="FirstParagraph"/>
       </w:pPr>
       <w:r>
-        <w:t xml:space="preserve">27 October2026 (Asia/Shanghai). Architecture: fresh-state LQR baseline plus causal PPO residual, freshness rejection, and supervisory authority. This is not full-command PPO/LQR switching. Prior failed experiments remain unchanged in reviewer-causal-v1. This document is a research update, not a declaration of submission or vehicle readiness.</w:t>
+        <w:t xml:space="preserve">27 October 2026 (Asia/Shanghai). Architecture: fresh-state LQR baseline plus causal PPO residual, freshness rejection, and supervisory authority. This is not full-command PPO/LQR switching. Prior failed experiments remain unchanged in reviewer-causal-v1. This document is a research update, not a declaration of submission or vehicle readiness.</w:t>
       </w:r>
     </w:p>
     <w:bookmarkStart w:id="20" w:name="what-was-completed"/>
@@ -37,7 +37,7 @@
         </w:numPr>
       </w:pPr>
       <w:r>
-        <w:t xml:space="preserve">Frozen864-episode follow-up:3 paired PPO/student seeds,20m/s,2development paths,exact left/right mirrors,4conditions,18methods. All864/864 episodes survived. Fresh development noise; no new training or outcome-driven tuning.</w:t>
+        <w:t xml:space="preserve">Frozen 864-episode follow-up: 3 paired PPO/student seeds, 20 m/s, 2 development paths, exact left/right mirrors, 4 conditions, 18 methods. All 864/864 episodes survived. Fresh development noise; no new training or outcome-driven tuning.</w:t>
       </w:r>
     </w:p>
     <w:p>
@@ -49,7 +49,7 @@
         </w:numPr>
       </w:pPr>
       <w:r>
-        <w:t xml:space="preserve">Independently recomputed raw metrics, causal low-pass recurrence, actuator bounds, fusion and204 exact severe-delay/LQR trajectory pairs.</w:t>
+        <w:t xml:space="preserve">Independently recomputed raw metrics, causal low-pass recurrence, actuator bounds, fusion and 204 exact severe-delay/LQR trajectory pairs.</w:t>
       </w:r>
     </w:p>
     <w:p>
@@ -61,7 +61,7 @@
         </w:numPr>
       </w:pPr>
       <w:r>
-        <w:t xml:space="preserve">Replayed202800 PPO and162240 submitted queries from recorded observations; zero action disagreements. All frozen input hashes and removed future/oracle channels checked.</w:t>
+        <w:t xml:space="preserve">Replayed 202800 PPO and 162240 submitted queries from recorded observations; zero action disagreements. All frozen input hashes and removed future/oracle channels checked.</w:t>
       </w:r>
     </w:p>
     <w:p>
@@ -73,7 +73,7 @@
         </w:numPr>
       </w:pPr>
       <w:r>
-        <w:t xml:space="preserve">Added same-profile student and both fixed±0.04rad controls to separate PPO learning from supervisory gain/filter effects.</w:t>
+        <w:t xml:space="preserve">Added same-profile student and both fixed±0.04 rad controls to separate PPO learning from supervisory gain/filter effects.</w:t>
       </w:r>
     </w:p>
     <w:p>
@@ -85,7 +85,7 @@
         </w:numPr>
       </w:pPr>
       <w:r>
-        <w:t xml:space="preserve">Implemented a disclosed nominal specialization of Wabersich–Zeilinger Eq5/Algorithm1; complete solver failures and fallback counts retained.</w:t>
+        <w:t xml:space="preserve">Implemented a disclosed nominal specialization of Wabersich–Zeilinger Eq 5/Algorithm 1; complete solver failures and fallback counts retained.</w:t>
       </w:r>
     </w:p>
     <w:p>
@@ -97,7 +97,7 @@
         </w:numPr>
       </w:pPr>
       <w:r>
-        <w:t xml:space="preserve">Ran predeclared randomized timer A/B with original10ms deadlines, actual PPO worker, observer/LQR, isolated generated worker contention and lower worker priorities. Independently replayed raw plant/observer/model/timestamps.</w:t>
+        <w:t xml:space="preserve">Ran predeclared randomized timer A/B with original 10 ms deadlines, actual PPO worker, observer/LQR, partitioned generated worker contention and lower worker priorities. Independently replayed raw plant/observer/model/timestamps.</w:t>
       </w:r>
     </w:p>
     <w:p>
@@ -109,7 +109,7 @@
         </w:numPr>
       </w:pPr>
       <w:r>
-        <w:t xml:space="preserve">Packaged full-controller Python3.10 laptop SIL kit with portable NumPy PPO, five fault cases, raw CSVs, independent verifier and Windows/macOS launchers. Clean minimal Linux dependency environment smoke-tested; actual target OS execution pending.</w:t>
+        <w:t xml:space="preserve">Packaged full-controller Python 3.10 laptop SIL kit with portable NumPy PPO, five fault cases, raw CSVs, independent verifier and Windows/macOS launchers. Clean minimal Linux dependency environment smoke-tested; actual target OS execution pending.</w:t>
       </w:r>
     </w:p>
     <w:bookmarkEnd w:id="20"/>
@@ -219,7 +219,7 @@
               <w:jc w:val="left"/>
             </w:pPr>
             <w:r>
-              <w:t xml:space="preserve">lqr/none</w:t>
+              <w:t xml:space="preserve">LQR</w:t>
             </w:r>
           </w:p>
         </w:tc>
@@ -281,7 +281,7 @@
               <w:jc w:val="left"/>
             </w:pPr>
             <w:r>
-              <w:t xml:space="preserve">age_original/negative</w:t>
+              <w:t xml:space="preserve">Age gain, −0.04</w:t>
             </w:r>
           </w:p>
         </w:tc>
@@ -343,7 +343,7 @@
               <w:jc w:val="left"/>
             </w:pPr>
             <w:r>
-              <w:t xml:space="preserve">age_original/positive</w:t>
+              <w:t xml:space="preserve">Age gain, +0.04</w:t>
             </w:r>
           </w:p>
         </w:tc>
@@ -405,7 +405,7 @@
               <w:jc w:val="left"/>
             </w:pPr>
             <w:r>
-              <w:t xml:space="preserve">age_original/student</w:t>
+              <w:t xml:space="preserve">Age gain, student</w:t>
             </w:r>
           </w:p>
         </w:tc>
@@ -467,7 +467,7 @@
               <w:jc w:val="left"/>
             </w:pPr>
             <w:r>
-              <w:t xml:space="preserve">age_original/ppo</w:t>
+              <w:t xml:space="preserve">Age gain, PPO</w:t>
             </w:r>
           </w:p>
         </w:tc>
@@ -529,7 +529,7 @@
               <w:jc w:val="left"/>
             </w:pPr>
             <w:r>
-              <w:t xml:space="preserve">age_filtered/negative</w:t>
+              <w:t xml:space="preserve">Filtered, −0.04</w:t>
             </w:r>
           </w:p>
         </w:tc>
@@ -591,7 +591,7 @@
               <w:jc w:val="left"/>
             </w:pPr>
             <w:r>
-              <w:t xml:space="preserve">age_filtered/positive</w:t>
+              <w:t xml:space="preserve">Filtered, +0.04</w:t>
             </w:r>
           </w:p>
         </w:tc>
@@ -653,7 +653,7 @@
               <w:jc w:val="left"/>
             </w:pPr>
             <w:r>
-              <w:t xml:space="preserve">age_filtered/student</w:t>
+              <w:t xml:space="preserve">Filtered, student</w:t>
             </w:r>
           </w:p>
         </w:tc>
@@ -715,7 +715,7 @@
               <w:jc w:val="left"/>
             </w:pPr>
             <w:r>
-              <w:t xml:space="preserve">age_filtered/ppo</w:t>
+              <w:t xml:space="preserve">Filtered, PPO</w:t>
             </w:r>
           </w:p>
         </w:tc>
@@ -777,7 +777,7 @@
               <w:jc w:val="left"/>
             </w:pPr>
             <w:r>
-              <w:t xml:space="preserve">predictive_filtered/negative</w:t>
+              <w:t xml:space="preserve">Predictive, −0.04</w:t>
             </w:r>
           </w:p>
         </w:tc>
@@ -839,7 +839,7 @@
               <w:jc w:val="left"/>
             </w:pPr>
             <w:r>
-              <w:t xml:space="preserve">predictive_filtered/positive</w:t>
+              <w:t xml:space="preserve">Predictive, +0.04</w:t>
             </w:r>
           </w:p>
         </w:tc>
@@ -901,7 +901,7 @@
               <w:jc w:val="left"/>
             </w:pPr>
             <w:r>
-              <w:t xml:space="preserve">predictive_filtered/student</w:t>
+              <w:t xml:space="preserve">Predictive, student</w:t>
             </w:r>
           </w:p>
         </w:tc>
@@ -963,7 +963,7 @@
               <w:jc w:val="left"/>
             </w:pPr>
             <w:r>
-              <w:t xml:space="preserve">predictive_filtered/ppo</w:t>
+              <w:t xml:space="preserve">Predictive, PPO</w:t>
             </w:r>
           </w:p>
         </w:tc>
@@ -1025,7 +1025,7 @@
               <w:jc w:val="left"/>
             </w:pPr>
             <w:r>
-              <w:t xml:space="preserve">preview_filtered/negative</w:t>
+              <w:t xml:space="preserve">Preview, −0.04</w:t>
             </w:r>
           </w:p>
         </w:tc>
@@ -1087,7 +1087,7 @@
               <w:jc w:val="left"/>
             </w:pPr>
             <w:r>
-              <w:t xml:space="preserve">preview_filtered/positive</w:t>
+              <w:t xml:space="preserve">Preview, +0.04</w:t>
             </w:r>
           </w:p>
         </w:tc>
@@ -1149,7 +1149,7 @@
               <w:jc w:val="left"/>
             </w:pPr>
             <w:r>
-              <w:t xml:space="preserve">preview_filtered/student</w:t>
+              <w:t xml:space="preserve">Preview, student</w:t>
             </w:r>
           </w:p>
         </w:tc>
@@ -1211,7 +1211,7 @@
               <w:jc w:val="left"/>
             </w:pPr>
             <w:r>
-              <w:t xml:space="preserve">preview_filtered/ppo</w:t>
+              <w:t xml:space="preserve">Preview, PPO</w:t>
             </w:r>
           </w:p>
         </w:tc>
@@ -1273,7 +1273,7 @@
               <w:jc w:val="left"/>
             </w:pPr>
             <w:r>
-              <w:t xml:space="preserve">nominal_psf/ppo</w:t>
+              <w:t xml:space="preserve">Nominal PSF, PPO</w:t>
             </w:r>
           </w:p>
         </w:tc>
@@ -1327,6 +1327,14 @@
         </w:tc>
       </w:tr>
     </w:tbl>
+    <w:p>
+      <w:pPr>
+        <w:pStyle w:val="BodyText"/>
+      </w:pPr>
+      <w:r>
+        <w:t xml:space="preserve">Labels: Age gain = age_original; Filtered = age_filtered; Predictive = predictive_filtered; Preview = preview_filtered. Signed numbers identify fixed residual proposals in radians. Student and PPO use identical profile settings.</w:t>
+      </w:r>
+    </w:p>
     <w:bookmarkEnd w:id="21"/>
     <w:bookmarkStart w:id="22" w:name="diagnosis-and-selection"/>
     <w:p>
@@ -1342,13 +1350,13 @@
         <w:pStyle w:val="FirstParagraph"/>
       </w:pPr>
       <w:r>
-        <w:t xml:space="preserve">The original age-gain PPO improves lateral tracking but strongly increases steering activity. The predefined0.1s low-pass and0.25authority cap reduce that activity, while still failing the5% steering trade-off criterion. The same-gain supervised student remains better than PPO in mean lateral RMSE, including two of three paired seeds for age_filtered. Thus the additional value of PPO fine-tuning is not established.</w:t>
+        <w:t xml:space="preserve">The original age-gain PPO improves lateral tracking but strongly increases steering activity. The predefined 0.1 s low-pass and 0.25 authority cap reduce that activity, while still failing the 5% steering trade-off criterion. The same-gain supervised student remains better than PPO in mean lateral RMSE, including two of three paired seeds for age_filtered. Thus the additional value of PPO fine-tuning is not established.</w:t>
       </w:r>
       <w:r>
         <w:t xml:space="preserve"> </w:t>
       </w:r>
       <w:r>
-        <w:t xml:space="preserve">Replacing raw command-jump cost with predicted physical actuator-rate cost alone admits almost no useful assistance. Observable curvature preview recovers a small tracking gain with modest heading/rate changes, but remains below the frozen1% tracking-gain threshold and does not consistently beat the student. This local20-step model/objective remains a bottleneck; these results do not isolate a single causal reason or prove a new cost will succeed.</w:t>
+        <w:t xml:space="preserve">Replacing raw command-jump cost with predicted physical actuator-rate cost alone admits almost no useful assistance. Observable curvature preview recovers a small tracking gain with modest heading/rate changes, but remains below the frozen 1% tracking-gain threshold and does not consistently beat the student. This local 20-step model/objective remains a bottleneck; these results do not isolate a single causal reason or prove a new cost will succeed.</w:t>
       </w:r>
     </w:p>
     <w:tbl>
@@ -1400,7 +1408,7 @@
               <w:jc w:val="left"/>
             </w:pPr>
             <w:r>
-              <w:t xml:space="preserve">lqr/none</w:t>
+              <w:t xml:space="preserve">LQR</w:t>
             </w:r>
           </w:p>
         </w:tc>
@@ -1426,7 +1434,7 @@
               <w:jc w:val="left"/>
             </w:pPr>
             <w:r>
-              <w:t xml:space="preserve">age_original/negative</w:t>
+              <w:t xml:space="preserve">Age gain, −0.04</w:t>
             </w:r>
           </w:p>
         </w:tc>
@@ -1452,7 +1460,7 @@
               <w:jc w:val="left"/>
             </w:pPr>
             <w:r>
-              <w:t xml:space="preserve">age_original/positive</w:t>
+              <w:t xml:space="preserve">Age gain, +0.04</w:t>
             </w:r>
           </w:p>
         </w:tc>
@@ -1478,7 +1486,7 @@
               <w:jc w:val="left"/>
             </w:pPr>
             <w:r>
-              <w:t xml:space="preserve">age_original/student</w:t>
+              <w:t xml:space="preserve">Age gain, student</w:t>
             </w:r>
           </w:p>
         </w:tc>
@@ -1504,7 +1512,7 @@
               <w:jc w:val="left"/>
             </w:pPr>
             <w:r>
-              <w:t xml:space="preserve">age_original/ppo</w:t>
+              <w:t xml:space="preserve">Age gain, PPO</w:t>
             </w:r>
           </w:p>
         </w:tc>
@@ -1530,7 +1538,7 @@
               <w:jc w:val="left"/>
             </w:pPr>
             <w:r>
-              <w:t xml:space="preserve">age_filtered/negative</w:t>
+              <w:t xml:space="preserve">Filtered, −0.04</w:t>
             </w:r>
           </w:p>
         </w:tc>
@@ -1556,7 +1564,7 @@
               <w:jc w:val="left"/>
             </w:pPr>
             <w:r>
-              <w:t xml:space="preserve">age_filtered/positive</w:t>
+              <w:t xml:space="preserve">Filtered, +0.04</w:t>
             </w:r>
           </w:p>
         </w:tc>
@@ -1582,7 +1590,7 @@
               <w:jc w:val="left"/>
             </w:pPr>
             <w:r>
-              <w:t xml:space="preserve">age_filtered/student</w:t>
+              <w:t xml:space="preserve">Filtered, student</w:t>
             </w:r>
           </w:p>
         </w:tc>
@@ -1608,7 +1616,7 @@
               <w:jc w:val="left"/>
             </w:pPr>
             <w:r>
-              <w:t xml:space="preserve">age_filtered/ppo</w:t>
+              <w:t xml:space="preserve">Filtered, PPO</w:t>
             </w:r>
           </w:p>
         </w:tc>
@@ -1634,7 +1642,7 @@
               <w:jc w:val="left"/>
             </w:pPr>
             <w:r>
-              <w:t xml:space="preserve">predictive_filtered/negative</w:t>
+              <w:t xml:space="preserve">Predictive, −0.04</w:t>
             </w:r>
           </w:p>
         </w:tc>
@@ -1660,7 +1668,7 @@
               <w:jc w:val="left"/>
             </w:pPr>
             <w:r>
-              <w:t xml:space="preserve">predictive_filtered/positive</w:t>
+              <w:t xml:space="preserve">Predictive, +0.04</w:t>
             </w:r>
           </w:p>
         </w:tc>
@@ -1686,7 +1694,7 @@
               <w:jc w:val="left"/>
             </w:pPr>
             <w:r>
-              <w:t xml:space="preserve">predictive_filtered/student</w:t>
+              <w:t xml:space="preserve">Predictive, student</w:t>
             </w:r>
           </w:p>
         </w:tc>
@@ -1712,7 +1720,7 @@
               <w:jc w:val="left"/>
             </w:pPr>
             <w:r>
-              <w:t xml:space="preserve">predictive_filtered/ppo</w:t>
+              <w:t xml:space="preserve">Predictive, PPO</w:t>
             </w:r>
           </w:p>
         </w:tc>
@@ -1738,7 +1746,7 @@
               <w:jc w:val="left"/>
             </w:pPr>
             <w:r>
-              <w:t xml:space="preserve">preview_filtered/negative</w:t>
+              <w:t xml:space="preserve">Preview, −0.04</w:t>
             </w:r>
           </w:p>
         </w:tc>
@@ -1764,7 +1772,7 @@
               <w:jc w:val="left"/>
             </w:pPr>
             <w:r>
-              <w:t xml:space="preserve">preview_filtered/positive</w:t>
+              <w:t xml:space="preserve">Preview, +0.04</w:t>
             </w:r>
           </w:p>
         </w:tc>
@@ -1790,7 +1798,7 @@
               <w:jc w:val="left"/>
             </w:pPr>
             <w:r>
-              <w:t xml:space="preserve">preview_filtered/student</w:t>
+              <w:t xml:space="preserve">Preview, student</w:t>
             </w:r>
           </w:p>
         </w:tc>
@@ -1816,7 +1824,7 @@
               <w:jc w:val="left"/>
             </w:pPr>
             <w:r>
-              <w:t xml:space="preserve">preview_filtered/ppo</w:t>
+              <w:t xml:space="preserve">Preview, PPO</w:t>
             </w:r>
           </w:p>
         </w:tc>
@@ -1842,7 +1850,7 @@
               <w:jc w:val="left"/>
             </w:pPr>
             <w:r>
-              <w:t xml:space="preserve">nominal_psf/ppo</w:t>
+              <w:t xml:space="preserve">Nominal PSF, PPO</w:t>
             </w:r>
           </w:p>
         </w:tc>
@@ -1865,7 +1873,7 @@
         <w:pStyle w:val="BodyText"/>
       </w:pPr>
       <w:r>
-        <w:t xml:space="preserve">Eligibility requires at least1% gain over LQR, same-profile student and both constants; positive student-relative gains for all three seeds; no survival loss; nominal no more than2% worse than LQR; heading and rate no more than5% worse than LQR.</w:t>
+        <w:t xml:space="preserve">Eligibility requires at least 1% gain over LQR, same-profile student and both constants; positive student-relative gains for all three seeds; no survival loss; nominal no more than 2% worse than LQR; heading and rate no more than 5% worse than LQR.</w:t>
       </w:r>
     </w:p>
     <w:p>
@@ -1901,13 +1909,13 @@
         <w:pStyle w:val="FirstParagraph"/>
       </w:pPr>
       <w:r>
-        <w:t xml:space="preserve">Primary source: Wabersich and Zeilinger, arXiv1812.05506v4, §4.1 Eq5 and Algorithm1, supplied by the author. The nominal quadratic program minimizes first-command deviation from the learned proposal, respects disclosed model-state/input limits, and uses a constant-curvature terminal equilibrium with shrinking-horizon recovery. The same noisy observer, nonlinear software plant, actuator limits, paths and delay cases were used for the matched experiment.</w:t>
+        <w:t xml:space="preserve">Primary source: Wabersich and Zeilinger, arXiv: 1812.05506v4, §4.1 Eq 5 and Algorithm 1, supplied by the author. The nominal quadratic program minimizes first-command deviation from the learned proposal, respects disclosed model-state/input limits, and uses a constant-curvature terminal equilibrium with shrinking-horizon recovery. The same noisy observer, nonlinear software plant, actuator limits, paths and delay cases were used for the matched experiment.</w:t>
       </w:r>
       <w:r>
         <w:t xml:space="preserve"> </w:t>
       </w:r>
       <w:r>
-        <w:t xml:space="preserve">This is a nominal linear specialization, not the authors’ implementation or a reproduction of their uncertainty-aware Algorithm2. Exact-model, state-knowledge and constant-curvature assumptions do not hold on this test plant. Consequently the paper’s safety theorem cannot be transferred. If the full and shortened programs fail, the fresh-state LQR fallback is explicitly uncertified. Do not interpret this comparison as superiority over the complete published method.</w:t>
+        <w:t xml:space="preserve">This is a nominal linear specialization, not the authors’ implementation or a reproduction of their uncertainty-aware Algorithm 2. Exact-model, state-knowledge and constant-curvature assumptions do not hold on this test plant. Consequently the paper’s safety theorem cannot be transferred. If the full and shortened programs fail, the fresh-state LQR fallback is explicitly uncertified. Do not interpret this comparison as superiority over the complete published method.</w:t>
       </w:r>
     </w:p>
     <w:p>
@@ -1915,7 +1923,7 @@
         <w:pStyle w:val="BodyText"/>
       </w:pPr>
       <w:r>
-        <w:t xml:space="preserve">Nominal PSF handled46776 command requests and logged1794 uncertified LQR fallback events. A request may solve both full and shortened programs. Its tracking gain is6.450%; its actuator-rate change is101.97%.</w:t>
+        <w:t xml:space="preserve">Nominal PSF handled 46776 command requests and logged 1794 uncertified LQR fallback events. A request may solve both full and shortened programs. Its tracking gain is 6.450%; its actuator-rate change is 101.97%.</w:t>
       </w:r>
       <w:r>
         <w:t xml:space="preserve"> </w:t>
@@ -1972,7 +1980,7 @@
               <w:jc w:val="right"/>
             </w:pPr>
             <w:r>
-              <w:t xml:space="preserve">Missed10ms deadlines</w:t>
+              <w:t xml:space="preserve">Missed 10 ms deadlines</w:t>
             </w:r>
           </w:p>
         </w:tc>
@@ -2107,7 +2115,7 @@
         <w:pStyle w:val="BodyText"/>
       </w:pPr>
       <w:r>
-        <w:t xml:space="preserve">Both profiles use the predefined age_filtered residual diagnostic and old25k PPO exports. Parent runs on one core; worker/nice10 and two generated stressors/nice19 run on the other. Native profile uses CLOCK_MONOTONIC absolute sleep plus at most100µs spin, preserving every original target and10ms deadline. Same noise per seed and randomized profile order. No OS isolation, privileged real-time scheduling or host contention exclusion exists.</w:t>
+        <w:t xml:space="preserve">Both profiles use the predefined age_filtered residual diagnostic and old 25 k PPO exports. Parent runs on one core; worker/nice 10 and two generated stressors/nice 19 run on the other. Native profile uses CLOCK_MONOTONIC absolute sleep plus at most 100 µs spin, preserving every original target and 10 ms deadline. Same noise per seed and randomized profile order. No OS isolation, privileged real-time scheduling or host contention exclusion exists.</w:t>
       </w:r>
       <w:r>
         <w:t xml:space="preserve"> </w:t>
@@ -2123,7 +2131,7 @@
         <w:t xml:space="preserve"> </w:t>
       </w:r>
       <w:r>
-        <w:t xml:space="preserve">Finite zero misses would establish only observed timing in this setting, not WCET. Fixed-step plant survival and functional LQR fallback do not prove continuously evolving real-time plant safety during host stalls. No100Hz or vehicle-readiness guarantee is made.</w:t>
+        <w:t xml:space="preserve">Finite zero misses would establish only observed timing in this setting, not WCET. Fixed-step plant survival and functional LQR fallback do not prove continuously evolving real-time plant safety during host stalls. No 100 Hz or vehicle-readiness guarantee is made.</w:t>
       </w:r>
     </w:p>
     <w:bookmarkEnd w:id="24"/>
@@ -2276,7 +2284,7 @@
               <w:jc w:val="left"/>
             </w:pPr>
             <w:r>
-              <w:t xml:space="preserve">Fresh local LQR is distinct from stalled PPO; no1000ms delayed-feedback LQR tolerance claim</w:t>
+              <w:t xml:space="preserve">Fresh local LQR is distinct from stalled PPO; no 1000 ms delayed-feedback LQR tolerance claim</w:t>
             </w:r>
           </w:p>
         </w:tc>
@@ -2432,7 +2440,7 @@
               <w:jc w:val="left"/>
             </w:pPr>
             <w:r>
-              <w:t xml:space="preserve">Frozen protocols,3paired seeds, reward equations, categorical distribution, thresholds, model/source hashes and raw traces supplied</w:t>
+              <w:t xml:space="preserve">Frozen protocols, 3 paired seeds, reward equations, categorical distribution, thresholds, model/source hashes and raw traces supplied</w:t>
             </w:r>
           </w:p>
         </w:tc>
@@ -2610,7 +2618,7 @@
               <w:jc w:val="left"/>
             </w:pPr>
             <w:r>
-              <w:t xml:space="preserve">Local10ms requirement</w:t>
+              <w:t xml:space="preserve">Local 10 ms requirement</w:t>
             </w:r>
           </w:p>
         </w:tc>
@@ -2674,7 +2682,7 @@
               <w:jc w:val="left"/>
             </w:pPr>
             <w:r>
-              <w:t xml:space="preserve">Nominal Eq5/Algorithm1 specialization complete; robust authors-code reproduction and full bibliographic metadata verification remain</w:t>
+              <w:t xml:space="preserve">Nominal Eq 5/Algorithm 1 specialization complete; robust authors-code reproduction and full bibliographic metadata verification remain</w:t>
             </w:r>
           </w:p>
         </w:tc>

</xml_diff>